<commit_message>
Add Deney 1 local snapshot without large binaries
</commit_message>
<xml_diff>
--- a/08_article/code_explanations/eye/Deney1_Frame_Secimi_Tam_Feedback_ve_Fonksiyon_Analizi.docx
+++ b/08_article/code_explanations/eye/Deney1_Frame_Secimi_Tam_Feedback_ve_Fonksiyon_Analizi.docx
@@ -92,7 +92,7 @@
         <w:spacing w:after="40"/>
       </w:pPr>
       <w:r>
-        <w:t>Google Drive bağlanır; kütüphaneler yüklenir ve sürümler ekrana yazılır.</w:t>
+        <w:t>local source package bağlanır; kütüphaneler yüklenir ve sürümler ekrana yazılır.</w:t>
       </w:r>
     </w:p>
     <w:p>
@@ -329,7 +329,7 @@
                 <w:b w:val="0"/>
                 <w:sz w:val="16"/>
               </w:rPr>
-              <w:t>Projenin ana Drive klasörü.</w:t>
+              <w:t>Projenin ana local source klasörü.</w:t>
             </w:r>
           </w:p>
         </w:tc>
@@ -1396,7 +1396,7 @@
                 <w:b w:val="0"/>
                 <w:sz w:val="16"/>
               </w:rPr>
-              <w:t>Drive yerine hızlı yerel diskten model yüklemek için.</w:t>
+              <w:t>local source yerine hızlı yerel diskten model yüklemek için.</w:t>
             </w:r>
           </w:p>
         </w:tc>
@@ -3348,7 +3348,7 @@
         <w:spacing w:after="80"/>
       </w:pPr>
       <w:r>
-        <w:t>Kritik düzeltme: Önceki mantıkta bütün seçimlerin tamamlanması beklenip sonra toplu kopyalama yapılırsa, Colab işlemi seçimden sonra veya sınıflar arasında kesildiğinde seçilen sonuçlar fiziksel olarak korunmayabilir. Güncel sürüm, her split seçilir seçilmez copy_selected_frames çağırır; ardından CSV ve checkpoint yazar. Böylece tamamlanan split hemen Drive’a kalıcılaştırılır.</w:t>
+        <w:t>Kritik düzeltme: Önceki mantıkta bütün seçimlerin tamamlanması beklenip sonra toplu kopyalama yapılırsa, Colab işlemi seçimden sonra veya sınıflar arasında kesildiğinde seçilen sonuçlar fiziksel olarak korunmayabilir. Güncel sürüm, her split seçilir seçilmez copy_selected_frames çağırır; ardından CSV ve checkpoint yazar. Böylece tamamlanan split hemen local source’a kalıcılaştırılır.</w:t>
       </w:r>
     </w:p>
     <w:p>
@@ -5285,7 +5285,7 @@
         <w:spacing w:after="80"/>
       </w:pPr>
       <w:r>
-        <w:t>Her split bittiğinde hemen kopyalama, CSV ve checkpoint yazma düzeltmesini yaptık; çünkü Colab oturumu uzun işlem sırasında kesilebilir. Böylece en azından tamamlanan splitin çıktısı Drive’da kalır. Ancak kod şu anda checkpointi okuyup kaldığı yerden devam etmediği için bu mekanizma tam resume değildir; ileride bunun ayrıca eklenmesi gerekir.</w:t>
+        <w:t>Her split bittiğinde hemen kopyalama, CSV ve checkpoint yazma düzeltmesini yaptık; çünkü Colab oturumu uzun işlem sırasında kesilebilir. Böylece en azından tamamlanan splitin çıktısı local source’da kalır. Ancak kod şu anda checkpointi okuyup kaldığı yerden devam etmediği için bu mekanizma tam resume değildir; ileride bunun ayrıca eklenmesi gerekir.</w:t>
       </w:r>
     </w:p>
     <w:p>

</xml_diff>